<commit_message>
Refine process governance workflow and supporting artifacts
</commit_message>
<xml_diff>
--- a/docs/reports/2026-07-30-关于申请AI工具及网络访问服务预算外报销的请示.docx
+++ b/docs/reports/2026-07-30-关于申请AI工具及网络访问服务预算外报销的请示.docx
@@ -416,7 +416,35 @@
               <w:rPr>
                 <w:sz w:val="21"/>
               </w:rPr>
-              <w:t>OpenAI ChatGPT Pro（5× 订阅档位）</w:t>
+              <w:t>OpenAI ChatGPT Pro（5</w:t>
+            </w:r>
+            <w:r>
+              <w:rPr>
+                <w:rFonts w:hint="eastAsia"/>
+                <w:sz w:val="21"/>
+                <w:lang w:eastAsia="zh-CN"/>
+              </w:rPr>
+              <w:t>x</w:t>
+            </w:r>
+            <w:r>
+              <w:rPr>
+                <w:sz w:val="21"/>
+              </w:rPr>
+              <w:t xml:space="preserve"> </w:t>
+            </w:r>
+            <w:proofErr w:type="spellStart"/>
+            <w:r>
+              <w:rPr>
+                <w:sz w:val="21"/>
+              </w:rPr>
+              <w:t>订阅档位</w:t>
+            </w:r>
+            <w:proofErr w:type="spellEnd"/>
+            <w:r>
+              <w:rPr>
+                <w:sz w:val="21"/>
+              </w:rPr>
+              <w:t>）</w:t>
             </w:r>
           </w:p>
         </w:tc>
@@ -1132,363 +1160,6 @@
           <w:lang w:eastAsia="zh-CN"/>
         </w:rPr>
       </w:pPr>
-      <w:r>
-        <w:rPr>
-          <w:lang w:eastAsia="zh-CN"/>
-        </w:rPr>
-        <w:br w:type="page"/>
-      </w:r>
-    </w:p>
-    <w:p>
-      <w:pPr>
-        <w:spacing w:after="0" w:line="360" w:lineRule="auto"/>
-        <w:rPr>
-          <w:rFonts w:hint="eastAsia"/>
-          <w:lang w:eastAsia="zh-CN"/>
-        </w:rPr>
-      </w:pPr>
-      <w:r>
-        <w:rPr>
-          <w:b/>
-          <w:sz w:val="32"/>
-          <w:lang w:eastAsia="zh-CN"/>
-        </w:rPr>
-        <w:lastRenderedPageBreak/>
-        <w:t>附件：月度费用统计表（报销时填写）</w:t>
-      </w:r>
-    </w:p>
-    <w:tbl>
-      <w:tblPr>
-        <w:tblStyle w:val="aff1"/>
-        <w:tblW w:w="0" w:type="auto"/>
-        <w:tblLayout w:type="fixed"/>
-        <w:tblLook w:val="04A0" w:firstRow="1" w:lastRow="0" w:firstColumn="1" w:lastColumn="0" w:noHBand="0" w:noVBand="1"/>
-      </w:tblPr>
-      <w:tblGrid>
-        <w:gridCol w:w="1247"/>
-        <w:gridCol w:w="1191"/>
-        <w:gridCol w:w="1984"/>
-        <w:gridCol w:w="1020"/>
-        <w:gridCol w:w="1701"/>
-        <w:gridCol w:w="1612"/>
-      </w:tblGrid>
-      <w:tr>
-        <w:tc>
-          <w:tcPr>
-            <w:tcW w:w="1247" w:type="dxa"/>
-            <w:shd w:val="clear" w:color="auto" w:fill="E7E6E6"/>
-            <w:vAlign w:val="center"/>
-          </w:tcPr>
-          <w:p>
-            <w:pPr>
-              <w:spacing w:line="288" w:lineRule="auto"/>
-              <w:jc w:val="center"/>
-              <w:rPr>
-                <w:rFonts w:hint="eastAsia"/>
-              </w:rPr>
-            </w:pPr>
-            <w:proofErr w:type="spellStart"/>
-            <w:r>
-              <w:rPr>
-                <w:b/>
-                <w:sz w:val="21"/>
-              </w:rPr>
-              <w:t>月份</w:t>
-            </w:r>
-            <w:proofErr w:type="spellEnd"/>
-          </w:p>
-        </w:tc>
-        <w:tc>
-          <w:tcPr>
-            <w:tcW w:w="1191" w:type="dxa"/>
-            <w:shd w:val="clear" w:color="auto" w:fill="E7E6E6"/>
-            <w:vAlign w:val="center"/>
-          </w:tcPr>
-          <w:p>
-            <w:pPr>
-              <w:spacing w:line="288" w:lineRule="auto"/>
-              <w:jc w:val="center"/>
-              <w:rPr>
-                <w:rFonts w:hint="eastAsia"/>
-              </w:rPr>
-            </w:pPr>
-            <w:r>
-              <w:rPr>
-                <w:b/>
-                <w:sz w:val="21"/>
-              </w:rPr>
-              <w:t>网络访问服务（元）</w:t>
-            </w:r>
-          </w:p>
-        </w:tc>
-        <w:tc>
-          <w:tcPr>
-            <w:tcW w:w="1984" w:type="dxa"/>
-            <w:shd w:val="clear" w:color="auto" w:fill="E7E6E6"/>
-            <w:vAlign w:val="center"/>
-          </w:tcPr>
-          <w:p>
-            <w:pPr>
-              <w:spacing w:line="288" w:lineRule="auto"/>
-              <w:jc w:val="center"/>
-              <w:rPr>
-                <w:rFonts w:hint="eastAsia"/>
-              </w:rPr>
-            </w:pPr>
-            <w:r>
-              <w:rPr>
-                <w:b/>
-                <w:sz w:val="21"/>
-              </w:rPr>
-              <w:t>ChatGPT Pro 实际扣费（原币/人民币）</w:t>
-            </w:r>
-          </w:p>
-        </w:tc>
-        <w:tc>
-          <w:tcPr>
-            <w:tcW w:w="1020" w:type="dxa"/>
-            <w:shd w:val="clear" w:color="auto" w:fill="E7E6E6"/>
-            <w:vAlign w:val="center"/>
-          </w:tcPr>
-          <w:p>
-            <w:pPr>
-              <w:spacing w:line="288" w:lineRule="auto"/>
-              <w:jc w:val="center"/>
-              <w:rPr>
-                <w:rFonts w:hint="eastAsia"/>
-              </w:rPr>
-            </w:pPr>
-            <w:proofErr w:type="spellStart"/>
-            <w:r>
-              <w:rPr>
-                <w:b/>
-                <w:sz w:val="21"/>
-              </w:rPr>
-              <w:t>当月合计（元</w:t>
-            </w:r>
-            <w:proofErr w:type="spellEnd"/>
-            <w:r>
-              <w:rPr>
-                <w:b/>
-                <w:sz w:val="21"/>
-              </w:rPr>
-              <w:t>）</w:t>
-            </w:r>
-          </w:p>
-        </w:tc>
-        <w:tc>
-          <w:tcPr>
-            <w:tcW w:w="1701" w:type="dxa"/>
-            <w:shd w:val="clear" w:color="auto" w:fill="E7E6E6"/>
-            <w:vAlign w:val="center"/>
-          </w:tcPr>
-          <w:p>
-            <w:pPr>
-              <w:spacing w:line="288" w:lineRule="auto"/>
-              <w:jc w:val="center"/>
-              <w:rPr>
-                <w:rFonts w:hint="eastAsia"/>
-              </w:rPr>
-            </w:pPr>
-            <w:r>
-              <w:rPr>
-                <w:b/>
-                <w:sz w:val="21"/>
-              </w:rPr>
-              <w:t>凭证编号或存放位置</w:t>
-            </w:r>
-          </w:p>
-        </w:tc>
-        <w:tc>
-          <w:tcPr>
-            <w:tcW w:w="1612" w:type="dxa"/>
-            <w:shd w:val="clear" w:color="auto" w:fill="E7E6E6"/>
-            <w:vAlign w:val="center"/>
-          </w:tcPr>
-          <w:p>
-            <w:pPr>
-              <w:spacing w:line="288" w:lineRule="auto"/>
-              <w:jc w:val="center"/>
-              <w:rPr>
-                <w:rFonts w:hint="eastAsia"/>
-              </w:rPr>
-            </w:pPr>
-            <w:r>
-              <w:rPr>
-                <w:b/>
-                <w:sz w:val="21"/>
-              </w:rPr>
-              <w:t>核对人</w:t>
-            </w:r>
-          </w:p>
-        </w:tc>
-      </w:tr>
-      <w:tr>
-        <w:tc>
-          <w:tcPr>
-            <w:tcW w:w="1247" w:type="dxa"/>
-            <w:vAlign w:val="center"/>
-          </w:tcPr>
-          <w:p>
-            <w:pPr>
-              <w:spacing w:line="276" w:lineRule="auto"/>
-              <w:jc w:val="center"/>
-              <w:rPr>
-                <w:rFonts w:hint="eastAsia"/>
-              </w:rPr>
-            </w:pPr>
-            <w:r>
-              <w:rPr>
-                <w:sz w:val="21"/>
-              </w:rPr>
-              <w:t>2026 年 __ 月</w:t>
-            </w:r>
-          </w:p>
-        </w:tc>
-        <w:tc>
-          <w:tcPr>
-            <w:tcW w:w="1191" w:type="dxa"/>
-            <w:vAlign w:val="center"/>
-          </w:tcPr>
-          <w:p>
-            <w:pPr>
-              <w:spacing w:line="276" w:lineRule="auto"/>
-              <w:rPr>
-                <w:rFonts w:hint="eastAsia"/>
-              </w:rPr>
-            </w:pPr>
-            <w:proofErr w:type="spellStart"/>
-            <w:r>
-              <w:rPr>
-                <w:sz w:val="21"/>
-              </w:rPr>
-              <w:t>待填写</w:t>
-            </w:r>
-            <w:proofErr w:type="spellEnd"/>
-          </w:p>
-        </w:tc>
-        <w:tc>
-          <w:tcPr>
-            <w:tcW w:w="1984" w:type="dxa"/>
-            <w:vAlign w:val="center"/>
-          </w:tcPr>
-          <w:p>
-            <w:pPr>
-              <w:spacing w:line="276" w:lineRule="auto"/>
-              <w:jc w:val="center"/>
-              <w:rPr>
-                <w:rFonts w:hint="eastAsia"/>
-              </w:rPr>
-            </w:pPr>
-            <w:r>
-              <w:rPr>
-                <w:sz w:val="21"/>
-              </w:rPr>
-              <w:t>待填写</w:t>
-            </w:r>
-          </w:p>
-        </w:tc>
-        <w:tc>
-          <w:tcPr>
-            <w:tcW w:w="1020" w:type="dxa"/>
-            <w:vAlign w:val="center"/>
-          </w:tcPr>
-          <w:p>
-            <w:pPr>
-              <w:spacing w:line="276" w:lineRule="auto"/>
-              <w:rPr>
-                <w:rFonts w:hint="eastAsia"/>
-              </w:rPr>
-            </w:pPr>
-            <w:proofErr w:type="spellStart"/>
-            <w:r>
-              <w:rPr>
-                <w:sz w:val="21"/>
-              </w:rPr>
-              <w:t>待填写</w:t>
-            </w:r>
-            <w:proofErr w:type="spellEnd"/>
-          </w:p>
-        </w:tc>
-        <w:tc>
-          <w:tcPr>
-            <w:tcW w:w="1701" w:type="dxa"/>
-            <w:vAlign w:val="center"/>
-          </w:tcPr>
-          <w:p>
-            <w:pPr>
-              <w:spacing w:line="276" w:lineRule="auto"/>
-              <w:rPr>
-                <w:rFonts w:hint="eastAsia"/>
-              </w:rPr>
-            </w:pPr>
-            <w:r>
-              <w:rPr>
-                <w:sz w:val="21"/>
-              </w:rPr>
-              <w:t>待填写</w:t>
-            </w:r>
-          </w:p>
-        </w:tc>
-        <w:tc>
-          <w:tcPr>
-            <w:tcW w:w="1612" w:type="dxa"/>
-            <w:vAlign w:val="center"/>
-          </w:tcPr>
-          <w:p>
-            <w:pPr>
-              <w:spacing w:line="276" w:lineRule="auto"/>
-              <w:rPr>
-                <w:rFonts w:hint="eastAsia"/>
-              </w:rPr>
-            </w:pPr>
-            <w:r>
-              <w:rPr>
-                <w:sz w:val="21"/>
-              </w:rPr>
-              <w:t>待填写</w:t>
-            </w:r>
-          </w:p>
-        </w:tc>
-      </w:tr>
-    </w:tbl>
-    <w:p>
-      <w:pPr>
-        <w:rPr>
-          <w:rFonts w:hint="eastAsia"/>
-        </w:rPr>
-      </w:pPr>
-    </w:p>
-    <w:p>
-      <w:pPr>
-        <w:spacing w:after="0" w:line="360" w:lineRule="auto"/>
-        <w:ind w:firstLine="420"/>
-        <w:jc w:val="both"/>
-        <w:rPr>
-          <w:rFonts w:hint="eastAsia"/>
-          <w:lang w:eastAsia="zh-CN"/>
-        </w:rPr>
-      </w:pPr>
-      <w:r>
-        <w:rPr>
-          <w:lang w:eastAsia="zh-CN"/>
-        </w:rPr>
-        <w:t>填写规则：外币订阅应同时</w:t>
-      </w:r>
-      <w:proofErr w:type="gramStart"/>
-      <w:r>
-        <w:rPr>
-          <w:lang w:eastAsia="zh-CN"/>
-        </w:rPr>
-        <w:t>登记原币金额</w:t>
-      </w:r>
-      <w:proofErr w:type="gramEnd"/>
-      <w:r>
-        <w:rPr>
-          <w:lang w:eastAsia="zh-CN"/>
-        </w:rPr>
-        <w:t>、实际人民币扣款金额、扣款日期和支付凭证。月度合计以实际人民币扣款金额计算，不以公开标价或估算汇率计算。</w:t>
-      </w:r>
     </w:p>
     <w:sectPr>
       <w:pgSz w:w="11906" w:h="16838"/>

</xml_diff>